<commit_message>
Modifiche al file delle idee per il progetto.
</commit_message>
<xml_diff>
--- a/Idee progetto large.docx
+++ b/Idee progetto large.docx
@@ -14,143 +14,6 @@
           <w:numId w:val="2"/>
         </w:numPr>
       </w:pPr>
-      <w:r>
-        <w:t>social di viaggi</w:t>
-      </w:r>
-    </w:p>
-    <w:p>
-      <w:r>
-        <w:t>Operazioni:</w:t>
-      </w:r>
-    </w:p>
-    <w:p>
-      <w:pPr>
-        <w:numPr>
-          <w:ilvl w:val="0"/>
-          <w:numId w:val="1"/>
-        </w:numPr>
-      </w:pPr>
-      <w:r>
-        <w:t>possibilità di uploadare foto e recensioni di località e monumenti</w:t>
-      </w:r>
-    </w:p>
-    <w:p>
-      <w:pPr>
-        <w:numPr>
-          <w:ilvl w:val="0"/>
-          <w:numId w:val="1"/>
-        </w:numPr>
-      </w:pPr>
-      <w:r>
-        <w:t>possibilità di seguire ed essere seguito</w:t>
-      </w:r>
-    </w:p>
-    <w:p>
-      <w:pPr>
-        <w:numPr>
-          <w:ilvl w:val="0"/>
-          <w:numId w:val="1"/>
-        </w:numPr>
-      </w:pPr>
-      <w:r>
-        <w:t>possibilità di raccomandare account con interessi simili</w:t>
-      </w:r>
-    </w:p>
-    <w:p>
-      <w:pPr>
-        <w:numPr>
-          <w:ilvl w:val="0"/>
-          <w:numId w:val="1"/>
-        </w:numPr>
-      </w:pPr>
-      <w:r>
-        <w:t>uso social in cui sono presentati gli ultimi posti recensiti dai propri seguiti</w:t>
-      </w:r>
-    </w:p>
-    <w:p>
-      <w:pPr>
-        <w:numPr>
-          <w:ilvl w:val="0"/>
-          <w:numId w:val="1"/>
-        </w:numPr>
-      </w:pPr>
-      <w:r>
-        <w:t>generare itinerario per viaggio basandosi sulle recensioni dei propri seguiti: l’utente può inserire una zona in cui vuole fare un viaggio e gli vengono consigliati i luoghi “migliori” in base alle recensioni dei suoi seguiti (altrimenti si basa su un punteggio generale dei luoghi). C’è la possibilità di generare ricerche basandosi su un raggio dal luogo centrale richiesto. Filtraggio risultati in base a categorie di posti da visitare (musei, parchi, …). Possibilità di scegliere il livello di attività/sedentarietà della vacanza.</w:t>
-      </w:r>
-    </w:p>
-    <w:p>
-      <w:pPr>
-        <w:numPr>
-          <w:ilvl w:val="0"/>
-          <w:numId w:val="1"/>
-        </w:numPr>
-      </w:pPr>
-      <w:r>
-        <w:t>statistiche sui luoghi più/meno visitati (possibilità di sponsorizzazione dei luoghi meno recensiti)</w:t>
-      </w:r>
-    </w:p>
-    <w:p>
-      <w:pPr>
-        <w:numPr>
-          <w:ilvl w:val="0"/>
-          <w:numId w:val="1"/>
-        </w:numPr>
-      </w:pPr>
-      <w:r>
-        <w:t>Analisi degli orari di punta per visitare specifiche attrazioni, utile per evitare la folla.</w:t>
-      </w:r>
-    </w:p>
-    <w:p>
-      <w:pPr>
-        <w:numPr>
-          <w:ilvl w:val="0"/>
-          <w:numId w:val="1"/>
-        </w:numPr>
-      </w:pPr>
-      <w:r>
-        <w:t>Visualizzazioni mensili e stagionali per ogni luogo (per evidenziare periodi di alta o bassa stagione).</w:t>
-      </w:r>
-    </w:p>
-    <w:p>
-      <w:pPr>
-        <w:numPr>
-          <w:ilvl w:val="0"/>
-          <w:numId w:val="1"/>
-        </w:numPr>
-      </w:pPr>
-      <w:r>
-        <w:t>Luoghi “trend” dell’ultimo mese o settimana per suggerire destinazioni emergenti.</w:t>
-      </w:r>
-    </w:p>
-    <w:p>
-      <w:pPr>
-        <w:numPr>
-          <w:ilvl w:val="0"/>
-          <w:numId w:val="1"/>
-        </w:numPr>
-      </w:pPr>
-      <w:r>
-        <w:t>Andamento storico delle recensioni e dei visitatori per ogni luogo, per capire come una destinazione è cambiata nel tempo in popolarità e percezione.</w:t>
-      </w:r>
-    </w:p>
-    <w:p>
-      <w:r>
-        <w:br w:type="page"/>
-      </w:r>
-    </w:p>
-    <w:p>
-      <w:r>
-        <w:lastRenderedPageBreak/>
-        <w:t>Argomento:</w:t>
-      </w:r>
-    </w:p>
-    <w:p>
-      <w:pPr>
-        <w:numPr>
-          <w:ilvl w:val="0"/>
-          <w:numId w:val="2"/>
-        </w:numPr>
-      </w:pPr>
       <w:proofErr w:type="spellStart"/>
       <w:r>
         <w:t>wineAdvisor</w:t>
@@ -1245,14 +1108,43 @@
           <w:strike/>
           <w:lang w:val="it-IT"/>
         </w:rPr>
-        <w:t>, in ogni review</w:t>
-      </w:r>
+        <w:t>, in ogni review togliere il campo “</w:t>
+      </w:r>
+      <w:proofErr w:type="spellStart"/>
       <w:r>
         <w:rPr>
           <w:strike/>
           <w:lang w:val="it-IT"/>
         </w:rPr>
-        <w:t xml:space="preserve"> togliere il campo “</w:t>
+        <w:t>language</w:t>
+      </w:r>
+      <w:proofErr w:type="spellEnd"/>
+      <w:r>
+        <w:rPr>
+          <w:strike/>
+          <w:lang w:val="it-IT"/>
+        </w:rPr>
+        <w:t>”.</w:t>
+      </w:r>
+    </w:p>
+    <w:p>
+      <w:pPr>
+        <w:pStyle w:val="Paragrafoelenco"/>
+        <w:numPr>
+          <w:ilvl w:val="0"/>
+          <w:numId w:val="7"/>
+        </w:numPr>
+        <w:rPr>
+          <w:strike/>
+          <w:lang w:val="it-IT"/>
+        </w:rPr>
+      </w:pPr>
+      <w:r>
+        <w:rPr>
+          <w:strike/>
+          <w:lang w:val="it-IT"/>
+        </w:rPr>
+        <w:t xml:space="preserve">Nel file </w:t>
       </w:r>
       <w:proofErr w:type="spellStart"/>
       <w:r>
@@ -1260,7 +1152,7 @@
           <w:strike/>
           <w:lang w:val="it-IT"/>
         </w:rPr>
-        <w:t>language</w:t>
+        <w:t>wines.json</w:t>
       </w:r>
       <w:proofErr w:type="spellEnd"/>
       <w:r>
@@ -1268,7 +1160,33 @@
           <w:strike/>
           <w:lang w:val="it-IT"/>
         </w:rPr>
-        <w:t>”.</w:t>
+        <w:t>,</w:t>
+      </w:r>
+      <w:r>
+        <w:rPr>
+          <w:strike/>
+        </w:rPr>
+        <w:t xml:space="preserve"> in ogni review aggiungere il campo “</w:t>
+      </w:r>
+      <w:proofErr w:type="spellStart"/>
+      <w:r>
+        <w:rPr>
+          <w:strike/>
+        </w:rPr>
+        <w:t>wine_id</w:t>
+      </w:r>
+      <w:proofErr w:type="spellEnd"/>
+      <w:r>
+        <w:rPr>
+          <w:strike/>
+        </w:rPr>
+        <w:t>”</w:t>
+      </w:r>
+      <w:r>
+        <w:rPr>
+          <w:strike/>
+        </w:rPr>
+        <w:t>.</w:t>
       </w:r>
     </w:p>
     <w:p>
@@ -1279,58 +1197,19 @@
           <w:numId w:val="7"/>
         </w:numPr>
         <w:rPr>
-          <w:strike/>
-          <w:lang w:val="it-IT"/>
-        </w:rPr>
-      </w:pPr>
-      <w:r>
-        <w:rPr>
-          <w:strike/>
-          <w:lang w:val="it-IT"/>
-        </w:rPr>
+          <w:lang w:val="it-IT"/>
+        </w:rPr>
+      </w:pPr>
+      <w:r>
         <w:t xml:space="preserve">Nel file </w:t>
       </w:r>
       <w:proofErr w:type="spellStart"/>
       <w:r>
-        <w:rPr>
-          <w:strike/>
-          <w:lang w:val="it-IT"/>
-        </w:rPr>
         <w:t>wines.json</w:t>
       </w:r>
       <w:proofErr w:type="spellEnd"/>
       <w:r>
-        <w:rPr>
-          <w:strike/>
-          <w:lang w:val="it-IT"/>
-        </w:rPr>
-        <w:t>,</w:t>
-      </w:r>
-      <w:r>
-        <w:rPr>
-          <w:strike/>
-        </w:rPr>
-        <w:t xml:space="preserve"> in ogni review</w:t>
-      </w:r>
-      <w:r>
-        <w:rPr>
-          <w:strike/>
-        </w:rPr>
-        <w:t xml:space="preserve"> aggiungere il campo “</w:t>
-      </w:r>
-      <w:proofErr w:type="spellStart"/>
-      <w:r>
-        <w:rPr>
-          <w:strike/>
-        </w:rPr>
-        <w:t>wine_id</w:t>
-      </w:r>
-      <w:proofErr w:type="spellEnd"/>
-      <w:r>
-        <w:rPr>
-          <w:strike/>
-        </w:rPr>
-        <w:t>.</w:t>
+        <w:t>, aggiungere un campo “rating” ad ogni vino</w:t>
       </w:r>
     </w:p>
     <w:sectPr>
@@ -1366,7 +1245,7 @@
         <v:path o:extrusionok="f" gradientshapeok="t" o:connecttype="rect"/>
         <o:lock v:ext="edit" aspectratio="t"/>
       </v:shapetype>
-      <v:shape id="_x0000_i1049" type="#_x0000_t75" style="width:11.4pt;height:11.4pt" o:bullet="t">
+      <v:shape id="_x0000_i1033" type="#_x0000_t75" style="width:11.4pt;height:11.4pt" o:bullet="t">
         <v:imagedata r:id="rId1" o:title="mso4371"/>
       </v:shape>
     </w:pict>
@@ -2685,6 +2564,7 @@
   <w:style w:type="character" w:default="1" w:styleId="Carpredefinitoparagrafo">
     <w:name w:val="Default Paragraph Font"/>
     <w:uiPriority w:val="1"/>
+    <w:semiHidden/>
     <w:unhideWhenUsed/>
   </w:style>
   <w:style w:type="table" w:default="1" w:styleId="Tabellanormale">

</xml_diff>